<commit_message>
release: module updates for suite 0.9.4
</commit_message>
<xml_diff>
--- a/app/templates/ebios-report-en.docx
+++ b/app/templates/ebios-report-en.docx
@@ -3324,11 +3324,21 @@
       </w:r>
     </w:p>
     <w:p>
+      <w:r>
+        <w:t>{#er_list}</w:t>
+      </w:r>
+    </w:p>
+    <w:p>
       <w:pPr>
         <w:pStyle w:val="ListBullet"/>
       </w:pPr>
       <w:r>
-        <w:t>{#er_list}{er}{/er_list}</w:t>
+        <w:t>{er}</w:t>
+      </w:r>
+    </w:p>
+    <w:p>
+      <w:r>
+        <w:t>{/er_list}</w:t>
       </w:r>
     </w:p>
     <w:p>

</xml_diff>